<commit_message>
Allow name-only or image-only searches
</commit_message>
<xml_diff>
--- a/Qalara Price Estimate Agent Plan - Updated.docx
+++ b/Qalara Price Estimate Agent Plan - Updated.docx
@@ -163,7 +163,7 @@
               <w:spacing w:after="40"/>
             </w:pPr>
             <w:r>
-              <w:t>Required product name and image; optional description, material and dimensions; required region and selected image-search provider.</w:t>
+              <w:t>Product name or image is required; either may be used alone or together. Description, material and dimensions are optional. Region is required.</w:t>
             </w:r>
           </w:p>
         </w:tc>
@@ -391,7 +391,7 @@
         <w:ind w:left="317" w:hanging="259"/>
       </w:pPr>
       <w:r>
-        <w:t>Product name is required and must contain non-whitespace text.</w:t>
+        <w:t>Product name is optional when an image is supplied. When entered, it must contain non-whitespace text.</w:t>
       </w:r>
     </w:p>
     <w:p>
@@ -402,7 +402,18 @@
         <w:ind w:left="317" w:hanging="259"/>
       </w:pPr>
       <w:r>
-        <w:t>One JPEG, PNG or WebP image is required. The current upload limit is 2 MB.</w:t>
+        <w:t>One JPEG, PNG or WebP image is optional when a product name is supplied. The current upload limit is 2 MB.</w:t>
+      </w:r>
+    </w:p>
+    <w:p>
+      <w:pPr>
+        <w:pStyle w:val="ListBullet"/>
+        <w:widowControl/>
+        <w:spacing w:after="60"/>
+        <w:ind w:left="317" w:hanging="259"/>
+      </w:pPr>
+      <w:r>
+        <w:t>At least one primary search input is required: product name or image. Both may be supplied together.</w:t>
       </w:r>
     </w:p>
     <w:p>
@@ -457,7 +468,7 @@
         <w:ind w:left="317" w:hanging="259"/>
       </w:pPr>
       <w:r>
-        <w:t>The image-search provider is chosen per search. SearchAPI and SerpApi are available; only the selected provider is called.</w:t>
+        <w:t>The image-search provider is chosen per search. SearchAPI and SerpApi are available; only the selected provider is called, and neither is called during a product-name-only search.</w:t>
       </w:r>
     </w:p>
     <w:p>
@@ -475,7 +486,7 @@
         <w:ind w:left="317" w:hanging="259"/>
       </w:pPr>
       <w:r>
-        <w:t>1.  The browser converts the selected image to a data URL and sends it with the form.</w:t>
+        <w:t>1.  When an image is selected, the browser converts it to a data URL and sends it with the form.</w:t>
       </w:r>
     </w:p>
     <w:p>
@@ -615,7 +626,7 @@
         <w:ind w:left="317" w:hanging="259"/>
       </w:pPr>
       <w:r>
-        <w:t>TinyFish runs one general text search and one marketplace-specific text search in parallel.</w:t>
+        <w:t>TinyFish runs one general text search and one marketplace-specific text search in parallel when a product name is supplied.</w:t>
       </w:r>
     </w:p>
     <w:p>
@@ -626,7 +637,18 @@
         <w:ind w:left="317" w:hanging="259"/>
       </w:pPr>
       <w:r>
-        <w:t>When configured, Firecrawl runs one additional text discovery search.</w:t>
+        <w:t>When configured, Firecrawl runs one additional text discovery search when a product name is supplied.</w:t>
+      </w:r>
+    </w:p>
+    <w:p>
+      <w:pPr>
+        <w:pStyle w:val="ListBullet"/>
+        <w:widowControl/>
+        <w:spacing w:after="60"/>
+        <w:ind w:left="317" w:hanging="259"/>
+      </w:pPr>
+      <w:r>
+        <w:t>A product-name-only search skips Blob upload and visual search. An image-only search skips TinyFish and Firecrawl text discovery but still uses TinyFish, with limited Firecrawl recovery, to read candidate PDPs. Supplying both combines both candidate sets.</w:t>
       </w:r>
     </w:p>
     <w:p>
@@ -1531,7 +1553,7 @@
         <w:ind w:left="317" w:hanging="259"/>
       </w:pPr>
       <w:r>
-        <w:t>Missing product name or image returns a validation error before provider calls.</w:t>
+        <w:t>Missing both product name and image returns a validation error before provider calls.</w:t>
       </w:r>
     </w:p>
     <w:p>

</xml_diff>

<commit_message>
Revert "Allow name-only or image-only searches"
This reverts commit 54ddd60036a27edcdfa09a1374bc14e90e97ead2.
</commit_message>
<xml_diff>
--- a/Qalara Price Estimate Agent Plan - Updated.docx
+++ b/Qalara Price Estimate Agent Plan - Updated.docx
@@ -163,7 +163,7 @@
               <w:spacing w:after="40"/>
             </w:pPr>
             <w:r>
-              <w:t>Product name or image is required; either may be used alone or together. Description, material and dimensions are optional. Region is required.</w:t>
+              <w:t>Required product name and image; optional description, material and dimensions; required region and selected image-search provider.</w:t>
             </w:r>
           </w:p>
         </w:tc>
@@ -391,7 +391,7 @@
         <w:ind w:left="317" w:hanging="259"/>
       </w:pPr>
       <w:r>
-        <w:t>Product name is optional when an image is supplied. When entered, it must contain non-whitespace text.</w:t>
+        <w:t>Product name is required and must contain non-whitespace text.</w:t>
       </w:r>
     </w:p>
     <w:p>
@@ -402,18 +402,7 @@
         <w:ind w:left="317" w:hanging="259"/>
       </w:pPr>
       <w:r>
-        <w:t>One JPEG, PNG or WebP image is optional when a product name is supplied. The current upload limit is 2 MB.</w:t>
-      </w:r>
-    </w:p>
-    <w:p>
-      <w:pPr>
-        <w:pStyle w:val="ListBullet"/>
-        <w:widowControl/>
-        <w:spacing w:after="60"/>
-        <w:ind w:left="317" w:hanging="259"/>
-      </w:pPr>
-      <w:r>
-        <w:t>At least one primary search input is required: product name or image. Both may be supplied together.</w:t>
+        <w:t>One JPEG, PNG or WebP image is required. The current upload limit is 2 MB.</w:t>
       </w:r>
     </w:p>
     <w:p>
@@ -468,7 +457,7 @@
         <w:ind w:left="317" w:hanging="259"/>
       </w:pPr>
       <w:r>
-        <w:t>The image-search provider is chosen per search. SearchAPI and SerpApi are available; only the selected provider is called, and neither is called during a product-name-only search.</w:t>
+        <w:t>The image-search provider is chosen per search. SearchAPI and SerpApi are available; only the selected provider is called.</w:t>
       </w:r>
     </w:p>
     <w:p>
@@ -486,7 +475,7 @@
         <w:ind w:left="317" w:hanging="259"/>
       </w:pPr>
       <w:r>
-        <w:t>1.  When an image is selected, the browser converts it to a data URL and sends it with the form.</w:t>
+        <w:t>1.  The browser converts the selected image to a data URL and sends it with the form.</w:t>
       </w:r>
     </w:p>
     <w:p>
@@ -626,7 +615,7 @@
         <w:ind w:left="317" w:hanging="259"/>
       </w:pPr>
       <w:r>
-        <w:t>TinyFish runs one general text search and one marketplace-specific text search in parallel when a product name is supplied.</w:t>
+        <w:t>TinyFish runs one general text search and one marketplace-specific text search in parallel.</w:t>
       </w:r>
     </w:p>
     <w:p>
@@ -637,18 +626,7 @@
         <w:ind w:left="317" w:hanging="259"/>
       </w:pPr>
       <w:r>
-        <w:t>When configured, Firecrawl runs one additional text discovery search when a product name is supplied.</w:t>
-      </w:r>
-    </w:p>
-    <w:p>
-      <w:pPr>
-        <w:pStyle w:val="ListBullet"/>
-        <w:widowControl/>
-        <w:spacing w:after="60"/>
-        <w:ind w:left="317" w:hanging="259"/>
-      </w:pPr>
-      <w:r>
-        <w:t>A product-name-only search skips Blob upload and visual search. An image-only search skips TinyFish and Firecrawl text discovery but still uses TinyFish, with limited Firecrawl recovery, to read candidate PDPs. Supplying both combines both candidate sets.</w:t>
+        <w:t>When configured, Firecrawl runs one additional text discovery search.</w:t>
       </w:r>
     </w:p>
     <w:p>
@@ -1553,7 +1531,7 @@
         <w:ind w:left="317" w:hanging="259"/>
       </w:pPr>
       <w:r>
-        <w:t>Missing both product name and image returns a validation error before provider calls.</w:t>
+        <w:t>Missing product name or image returns a validation error before provider calls.</w:t>
       </w:r>
     </w:p>
     <w:p>

</xml_diff>